<commit_message>
docs: cap nhat toan bo markdown va hinh anh minh chung cho cac buoi 1, 2, 3, 4
</commit_message>
<xml_diff>
--- a/Buoi5_21_10_26/BaoCaoTuan 5.docx
+++ b/Buoi5_21_10_26/BaoCaoTuan 5.docx
@@ -1418,19 +1418,9 @@
           <w:sz w:val="28"/>
           <w:szCs w:val="28"/>
         </w:rPr>
-        <w:t>default_</w:t>
-      </w:r>
-      <w:proofErr w:type="gramStart"/>
-      <w:r>
-        <w:rPr>
-          <w:rFonts w:ascii="Times New Roman" w:hAnsi="Times New Roman" w:cs="Times New Roman"/>
-          <w:sz w:val="28"/>
-          <w:szCs w:val="28"/>
-        </w:rPr>
-        <w:t>rules.json</w:t>
-      </w:r>
-      <w:proofErr w:type="spellEnd"/>
-      <w:proofErr w:type="gramEnd"/>
+        <w:t>default_rules.json</w:t>
+      </w:r>
+      <w:proofErr w:type="spellEnd"/>
       <w:r>
         <w:rPr>
           <w:rFonts w:ascii="Times New Roman" w:hAnsi="Times New Roman" w:cs="Times New Roman"/>
@@ -1543,7 +1533,6 @@
         <w:t xml:space="preserve"> file </w:t>
       </w:r>
       <w:proofErr w:type="spellStart"/>
-      <w:proofErr w:type="gramStart"/>
       <w:r>
         <w:rPr>
           <w:rFonts w:ascii="Times New Roman" w:hAnsi="Times New Roman" w:cs="Times New Roman"/>
@@ -1553,7 +1542,6 @@
         <w:t>report.sarif</w:t>
       </w:r>
       <w:proofErr w:type="spellEnd"/>
-      <w:proofErr w:type="gramEnd"/>
       <w:r>
         <w:rPr>
           <w:rFonts w:ascii="Times New Roman" w:hAnsi="Times New Roman" w:cs="Times New Roman"/>
@@ -1881,21 +1869,9 @@
           <w:sz w:val="28"/>
           <w:szCs w:val="28"/>
         </w:rPr>
-        <w:t>sast_</w:t>
-      </w:r>
-      <w:proofErr w:type="gramStart"/>
-      <w:r>
-        <w:rPr>
-          <w:rFonts w:ascii="Times New Roman" w:hAnsi="Times New Roman" w:cs="Times New Roman"/>
-          <w:i/>
-          <w:iCs/>
-          <w:sz w:val="28"/>
-          <w:szCs w:val="28"/>
-        </w:rPr>
-        <w:t>tool.main</w:t>
-      </w:r>
-      <w:proofErr w:type="spellEnd"/>
-      <w:proofErr w:type="gramEnd"/>
+        <w:t>sast_tool.main</w:t>
+      </w:r>
+      <w:proofErr w:type="spellEnd"/>
       <w:r>
         <w:rPr>
           <w:rFonts w:ascii="Times New Roman" w:hAnsi="Times New Roman" w:cs="Times New Roman"/>
@@ -2136,7 +2112,6 @@
         <w:t xml:space="preserve"> </w:t>
       </w:r>
       <w:proofErr w:type="spellStart"/>
-      <w:proofErr w:type="gramStart"/>
       <w:r>
         <w:rPr>
           <w:rFonts w:ascii="Times New Roman" w:hAnsi="Times New Roman" w:cs="Times New Roman"/>
@@ -2146,7 +2121,6 @@
         <w:t>report.sarif</w:t>
       </w:r>
       <w:proofErr w:type="spellEnd"/>
-      <w:proofErr w:type="gramEnd"/>
       <w:r>
         <w:rPr>
           <w:rFonts w:ascii="Times New Roman" w:hAnsi="Times New Roman" w:cs="Times New Roman"/>
@@ -2547,25 +2521,7 @@
           <w:sz w:val="28"/>
           <w:szCs w:val="28"/>
         </w:rPr>
-        <w:t xml:space="preserve"> </w:t>
-      </w:r>
-      <w:proofErr w:type="gramStart"/>
-      <w:r>
-        <w:rPr>
-          <w:rFonts w:ascii="Times New Roman" w:hAnsi="Times New Roman" w:cs="Times New Roman"/>
-          <w:sz w:val="28"/>
-          <w:szCs w:val="28"/>
-        </w:rPr>
-        <w:t>eval(</w:t>
-      </w:r>
-      <w:proofErr w:type="gramEnd"/>
-      <w:r>
-        <w:rPr>
-          <w:rFonts w:ascii="Times New Roman" w:hAnsi="Times New Roman" w:cs="Times New Roman"/>
-          <w:sz w:val="28"/>
-          <w:szCs w:val="28"/>
-        </w:rPr>
-        <w:t xml:space="preserve">) </w:t>
+        <w:t xml:space="preserve"> eval() </w:t>
       </w:r>
       <w:proofErr w:type="spellStart"/>
       <w:r>
@@ -4072,8 +4028,556 @@
           <w:sz w:val="28"/>
           <w:szCs w:val="28"/>
         </w:rPr>
-        <w:t xml:space="preserve"> khác</w:t>
-      </w:r>
+        <w:t xml:space="preserve"> </w:t>
+      </w:r>
+      <w:proofErr w:type="spellStart"/>
+      <w:r>
+        <w:rPr>
+          <w:rFonts w:ascii="Times New Roman" w:hAnsi="Times New Roman" w:cs="Times New Roman"/>
+          <w:sz w:val="28"/>
+          <w:szCs w:val="28"/>
+        </w:rPr>
+        <w:t>khác</w:t>
+      </w:r>
+      <w:proofErr w:type="spellEnd"/>
+    </w:p>
+    <w:p>
+      <w:pPr>
+        <w:jc w:val="center"/>
+        <w:rPr>
+          <w:rFonts w:ascii="Times New Roman" w:hAnsi="Times New Roman" w:cs="Times New Roman"/>
+          <w:sz w:val="28"/>
+          <w:szCs w:val="28"/>
+        </w:rPr>
+      </w:pPr>
+      <w:r>
+        <w:rPr>
+          <w:rFonts w:ascii="Times New Roman" w:hAnsi="Times New Roman" w:cs="Times New Roman"/>
+          <w:sz w:val="28"/>
+          <w:szCs w:val="28"/>
+        </w:rPr>
+        <w:lastRenderedPageBreak/>
+        <w:drawing>
+          <wp:inline distT="0" distB="0" distL="0" distR="0" wp14:anchorId="2F79339F" wp14:editId="57BE25D7">
+            <wp:extent cx="5868219" cy="2076740"/>
+            <wp:effectExtent l="0" t="0" r="0" b="0"/>
+            <wp:docPr id="339626297" name="Picture 1"/>
+            <wp:cNvGraphicFramePr>
+              <a:graphicFrameLocks xmlns:a="http://schemas.openxmlformats.org/drawingml/2006/main" noChangeAspect="1"/>
+            </wp:cNvGraphicFramePr>
+            <a:graphic xmlns:a="http://schemas.openxmlformats.org/drawingml/2006/main">
+              <a:graphicData uri="http://schemas.openxmlformats.org/drawingml/2006/picture">
+                <pic:pic xmlns:pic="http://schemas.openxmlformats.org/drawingml/2006/picture">
+                  <pic:nvPicPr>
+                    <pic:cNvPr id="339626297" name=""/>
+                    <pic:cNvPicPr/>
+                  </pic:nvPicPr>
+                  <pic:blipFill>
+                    <a:blip r:embed="rId10"/>
+                    <a:stretch>
+                      <a:fillRect/>
+                    </a:stretch>
+                  </pic:blipFill>
+                  <pic:spPr>
+                    <a:xfrm>
+                      <a:off x="0" y="0"/>
+                      <a:ext cx="5868219" cy="2076740"/>
+                    </a:xfrm>
+                    <a:prstGeom prst="rect">
+                      <a:avLst/>
+                    </a:prstGeom>
+                  </pic:spPr>
+                </pic:pic>
+              </a:graphicData>
+            </a:graphic>
+          </wp:inline>
+        </w:drawing>
+      </w:r>
+      <w:r>
+        <w:rPr>
+          <w:rFonts w:ascii="Times New Roman" w:hAnsi="Times New Roman" w:cs="Times New Roman"/>
+          <w:sz w:val="28"/>
+          <w:szCs w:val="28"/>
+        </w:rPr>
+        <w:br/>
+      </w:r>
+      <w:proofErr w:type="spellStart"/>
+      <w:r>
+        <w:rPr>
+          <w:rFonts w:ascii="Times New Roman" w:hAnsi="Times New Roman" w:cs="Times New Roman"/>
+          <w:sz w:val="28"/>
+          <w:szCs w:val="28"/>
+        </w:rPr>
+        <w:t>Hình</w:t>
+      </w:r>
+      <w:proofErr w:type="spellEnd"/>
+      <w:r>
+        <w:rPr>
+          <w:rFonts w:ascii="Times New Roman" w:hAnsi="Times New Roman" w:cs="Times New Roman"/>
+          <w:sz w:val="28"/>
+          <w:szCs w:val="28"/>
+        </w:rPr>
+        <w:t xml:space="preserve"> </w:t>
+      </w:r>
+      <w:r>
+        <w:rPr>
+          <w:rFonts w:ascii="Times New Roman" w:hAnsi="Times New Roman" w:cs="Times New Roman"/>
+          <w:sz w:val="28"/>
+          <w:szCs w:val="28"/>
+        </w:rPr>
+        <w:t>6</w:t>
+      </w:r>
+      <w:r>
+        <w:rPr>
+          <w:rFonts w:ascii="Times New Roman" w:hAnsi="Times New Roman" w:cs="Times New Roman"/>
+          <w:sz w:val="28"/>
+          <w:szCs w:val="28"/>
+        </w:rPr>
+        <w:t xml:space="preserve">: push code </w:t>
+      </w:r>
+      <w:proofErr w:type="spellStart"/>
+      <w:r>
+        <w:rPr>
+          <w:rFonts w:ascii="Times New Roman" w:hAnsi="Times New Roman" w:cs="Times New Roman"/>
+          <w:sz w:val="28"/>
+          <w:szCs w:val="28"/>
+        </w:rPr>
+        <w:t>lên</w:t>
+      </w:r>
+      <w:proofErr w:type="spellEnd"/>
+      <w:r>
+        <w:rPr>
+          <w:rFonts w:ascii="Times New Roman" w:hAnsi="Times New Roman" w:cs="Times New Roman"/>
+          <w:sz w:val="28"/>
+          <w:szCs w:val="28"/>
+        </w:rPr>
+        <w:t xml:space="preserve"> </w:t>
+      </w:r>
+      <w:proofErr w:type="spellStart"/>
+      <w:r>
+        <w:rPr>
+          <w:rFonts w:ascii="Times New Roman" w:hAnsi="Times New Roman" w:cs="Times New Roman"/>
+          <w:sz w:val="28"/>
+          <w:szCs w:val="28"/>
+        </w:rPr>
+        <w:t>github</w:t>
+      </w:r>
+      <w:proofErr w:type="spellEnd"/>
+    </w:p>
+    <w:p>
+      <w:pPr>
+        <w:jc w:val="center"/>
+        <w:rPr>
+          <w:rFonts w:ascii="Times New Roman" w:hAnsi="Times New Roman" w:cs="Times New Roman"/>
+          <w:sz w:val="28"/>
+          <w:szCs w:val="28"/>
+        </w:rPr>
+      </w:pPr>
+    </w:p>
+    <w:p>
+      <w:pPr>
+        <w:rPr>
+          <w:rFonts w:ascii="Times New Roman" w:hAnsi="Times New Roman" w:cs="Times New Roman"/>
+          <w:b/>
+          <w:bCs/>
+          <w:sz w:val="36"/>
+          <w:szCs w:val="36"/>
+        </w:rPr>
+      </w:pPr>
+      <w:r>
+        <w:rPr>
+          <w:rFonts w:ascii="Times New Roman" w:hAnsi="Times New Roman" w:cs="Times New Roman"/>
+          <w:b/>
+          <w:bCs/>
+          <w:sz w:val="36"/>
+          <w:szCs w:val="36"/>
+        </w:rPr>
+        <w:t>5.4 THỰC HÀNH: DAST-TOOL</w:t>
+      </w:r>
+    </w:p>
+    <w:p>
+      <w:pPr>
+        <w:rPr>
+          <w:rFonts w:ascii="Times New Roman" w:hAnsi="Times New Roman" w:cs="Times New Roman"/>
+          <w:b/>
+          <w:bCs/>
+          <w:sz w:val="36"/>
+          <w:szCs w:val="36"/>
+        </w:rPr>
+      </w:pPr>
+      <w:r>
+        <w:rPr>
+          <w:rFonts w:ascii="Times New Roman" w:hAnsi="Times New Roman" w:cs="Times New Roman"/>
+          <w:b/>
+          <w:bCs/>
+          <w:sz w:val="36"/>
+          <w:szCs w:val="36"/>
+        </w:rPr>
+        <w:drawing>
+          <wp:inline distT="0" distB="0" distL="0" distR="0" wp14:anchorId="283820D0" wp14:editId="2571091C">
+            <wp:extent cx="5943600" cy="901065"/>
+            <wp:effectExtent l="0" t="0" r="0" b="0"/>
+            <wp:docPr id="524630361" name="Picture 1"/>
+            <wp:cNvGraphicFramePr>
+              <a:graphicFrameLocks xmlns:a="http://schemas.openxmlformats.org/drawingml/2006/main" noChangeAspect="1"/>
+            </wp:cNvGraphicFramePr>
+            <a:graphic xmlns:a="http://schemas.openxmlformats.org/drawingml/2006/main">
+              <a:graphicData uri="http://schemas.openxmlformats.org/drawingml/2006/picture">
+                <pic:pic xmlns:pic="http://schemas.openxmlformats.org/drawingml/2006/picture">
+                  <pic:nvPicPr>
+                    <pic:cNvPr id="524630361" name=""/>
+                    <pic:cNvPicPr/>
+                  </pic:nvPicPr>
+                  <pic:blipFill>
+                    <a:blip r:embed="rId11"/>
+                    <a:stretch>
+                      <a:fillRect/>
+                    </a:stretch>
+                  </pic:blipFill>
+                  <pic:spPr>
+                    <a:xfrm>
+                      <a:off x="0" y="0"/>
+                      <a:ext cx="5943600" cy="901065"/>
+                    </a:xfrm>
+                    <a:prstGeom prst="rect">
+                      <a:avLst/>
+                    </a:prstGeom>
+                  </pic:spPr>
+                </pic:pic>
+              </a:graphicData>
+            </a:graphic>
+          </wp:inline>
+        </w:drawing>
+      </w:r>
+    </w:p>
+    <w:p>
+      <w:pPr>
+        <w:jc w:val="center"/>
+        <w:rPr>
+          <w:rFonts w:ascii="Times New Roman" w:hAnsi="Times New Roman" w:cs="Times New Roman"/>
+          <w:sz w:val="36"/>
+          <w:szCs w:val="36"/>
+        </w:rPr>
+      </w:pPr>
+      <w:proofErr w:type="spellStart"/>
+      <w:r>
+        <w:rPr>
+          <w:rFonts w:ascii="Times New Roman" w:hAnsi="Times New Roman" w:cs="Times New Roman"/>
+          <w:sz w:val="36"/>
+          <w:szCs w:val="36"/>
+        </w:rPr>
+        <w:t>Hình</w:t>
+      </w:r>
+      <w:proofErr w:type="spellEnd"/>
+      <w:r>
+        <w:rPr>
+          <w:rFonts w:ascii="Times New Roman" w:hAnsi="Times New Roman" w:cs="Times New Roman"/>
+          <w:sz w:val="36"/>
+          <w:szCs w:val="36"/>
+        </w:rPr>
+        <w:t xml:space="preserve"> 7: </w:t>
+      </w:r>
+      <w:proofErr w:type="spellStart"/>
+      <w:r>
+        <w:rPr>
+          <w:rFonts w:ascii="Times New Roman" w:hAnsi="Times New Roman" w:cs="Times New Roman"/>
+          <w:sz w:val="36"/>
+          <w:szCs w:val="36"/>
+        </w:rPr>
+        <w:t>Chạy</w:t>
+      </w:r>
+      <w:proofErr w:type="spellEnd"/>
+      <w:r>
+        <w:rPr>
+          <w:rFonts w:ascii="Times New Roman" w:hAnsi="Times New Roman" w:cs="Times New Roman"/>
+          <w:sz w:val="36"/>
+          <w:szCs w:val="36"/>
+        </w:rPr>
+        <w:t xml:space="preserve"> Unit Test</w:t>
+      </w:r>
+    </w:p>
+    <w:p>
+      <w:pPr>
+        <w:jc w:val="center"/>
+        <w:rPr>
+          <w:rFonts w:ascii="Times New Roman" w:hAnsi="Times New Roman" w:cs="Times New Roman"/>
+          <w:sz w:val="36"/>
+          <w:szCs w:val="36"/>
+        </w:rPr>
+      </w:pPr>
+    </w:p>
+    <w:p>
+      <w:pPr>
+        <w:jc w:val="center"/>
+        <w:rPr>
+          <w:rFonts w:ascii="Times New Roman" w:hAnsi="Times New Roman" w:cs="Times New Roman"/>
+          <w:sz w:val="36"/>
+          <w:szCs w:val="36"/>
+        </w:rPr>
+      </w:pPr>
+      <w:r>
+        <w:rPr>
+          <w:rFonts w:ascii="Times New Roman" w:hAnsi="Times New Roman" w:cs="Times New Roman"/>
+          <w:sz w:val="36"/>
+          <w:szCs w:val="36"/>
+        </w:rPr>
+        <w:drawing>
+          <wp:inline distT="0" distB="0" distL="0" distR="0" wp14:anchorId="63BDC41A" wp14:editId="0E94F2B2">
+            <wp:extent cx="5943600" cy="1725930"/>
+            <wp:effectExtent l="0" t="0" r="0" b="7620"/>
+            <wp:docPr id="1521409235" name="Picture 1"/>
+            <wp:cNvGraphicFramePr>
+              <a:graphicFrameLocks xmlns:a="http://schemas.openxmlformats.org/drawingml/2006/main" noChangeAspect="1"/>
+            </wp:cNvGraphicFramePr>
+            <a:graphic xmlns:a="http://schemas.openxmlformats.org/drawingml/2006/main">
+              <a:graphicData uri="http://schemas.openxmlformats.org/drawingml/2006/picture">
+                <pic:pic xmlns:pic="http://schemas.openxmlformats.org/drawingml/2006/picture">
+                  <pic:nvPicPr>
+                    <pic:cNvPr id="1521409235" name=""/>
+                    <pic:cNvPicPr/>
+                  </pic:nvPicPr>
+                  <pic:blipFill>
+                    <a:blip r:embed="rId12"/>
+                    <a:stretch>
+                      <a:fillRect/>
+                    </a:stretch>
+                  </pic:blipFill>
+                  <pic:spPr>
+                    <a:xfrm>
+                      <a:off x="0" y="0"/>
+                      <a:ext cx="5943600" cy="1725930"/>
+                    </a:xfrm>
+                    <a:prstGeom prst="rect">
+                      <a:avLst/>
+                    </a:prstGeom>
+                  </pic:spPr>
+                </pic:pic>
+              </a:graphicData>
+            </a:graphic>
+          </wp:inline>
+        </w:drawing>
+      </w:r>
+    </w:p>
+    <w:p>
+      <w:pPr>
+        <w:jc w:val="center"/>
+        <w:rPr>
+          <w:rFonts w:ascii="Times New Roman" w:hAnsi="Times New Roman" w:cs="Times New Roman"/>
+          <w:sz w:val="36"/>
+          <w:szCs w:val="36"/>
+        </w:rPr>
+      </w:pPr>
+      <w:proofErr w:type="spellStart"/>
+      <w:r>
+        <w:rPr>
+          <w:rFonts w:ascii="Times New Roman" w:hAnsi="Times New Roman" w:cs="Times New Roman"/>
+          <w:sz w:val="36"/>
+          <w:szCs w:val="36"/>
+        </w:rPr>
+        <w:t>Hình</w:t>
+      </w:r>
+      <w:proofErr w:type="spellEnd"/>
+      <w:r>
+        <w:rPr>
+          <w:rFonts w:ascii="Times New Roman" w:hAnsi="Times New Roman" w:cs="Times New Roman"/>
+          <w:sz w:val="36"/>
+          <w:szCs w:val="36"/>
+        </w:rPr>
+        <w:t xml:space="preserve"> 8: </w:t>
+      </w:r>
+      <w:proofErr w:type="spellStart"/>
+      <w:r>
+        <w:rPr>
+          <w:rFonts w:ascii="Times New Roman" w:hAnsi="Times New Roman" w:cs="Times New Roman"/>
+          <w:sz w:val="36"/>
+          <w:szCs w:val="36"/>
+        </w:rPr>
+        <w:t>Chạy</w:t>
+      </w:r>
+      <w:proofErr w:type="spellEnd"/>
+      <w:r>
+        <w:rPr>
+          <w:rFonts w:ascii="Times New Roman" w:hAnsi="Times New Roman" w:cs="Times New Roman"/>
+          <w:sz w:val="36"/>
+          <w:szCs w:val="36"/>
+        </w:rPr>
+        <w:t xml:space="preserve"> file </w:t>
+      </w:r>
+      <w:r>
+        <w:rPr>
+          <w:rFonts w:ascii="Times New Roman" w:hAnsi="Times New Roman" w:cs="Times New Roman"/>
+          <w:i/>
+          <w:iCs/>
+          <w:sz w:val="36"/>
+          <w:szCs w:val="36"/>
+        </w:rPr>
+        <w:t>“main.py”</w:t>
+      </w:r>
+    </w:p>
+    <w:p>
+      <w:pPr>
+        <w:jc w:val="center"/>
+        <w:rPr>
+          <w:rFonts w:ascii="Times New Roman" w:hAnsi="Times New Roman" w:cs="Times New Roman"/>
+          <w:sz w:val="36"/>
+          <w:szCs w:val="36"/>
+        </w:rPr>
+      </w:pPr>
+    </w:p>
+    <w:p>
+      <w:pPr>
+        <w:jc w:val="center"/>
+        <w:rPr>
+          <w:rFonts w:ascii="Times New Roman" w:hAnsi="Times New Roman" w:cs="Times New Roman"/>
+          <w:sz w:val="36"/>
+          <w:szCs w:val="36"/>
+        </w:rPr>
+      </w:pPr>
+      <w:r>
+        <w:rPr>
+          <w:rFonts w:ascii="Times New Roman" w:hAnsi="Times New Roman" w:cs="Times New Roman"/>
+          <w:sz w:val="36"/>
+          <w:szCs w:val="36"/>
+        </w:rPr>
+        <w:lastRenderedPageBreak/>
+        <w:drawing>
+          <wp:inline distT="0" distB="0" distL="0" distR="0" wp14:anchorId="590F83B9" wp14:editId="6F0CAFD2">
+            <wp:extent cx="5943600" cy="1237615"/>
+            <wp:effectExtent l="0" t="0" r="0" b="635"/>
+            <wp:docPr id="1413748006" name="Picture 1"/>
+            <wp:cNvGraphicFramePr>
+              <a:graphicFrameLocks xmlns:a="http://schemas.openxmlformats.org/drawingml/2006/main" noChangeAspect="1"/>
+            </wp:cNvGraphicFramePr>
+            <a:graphic xmlns:a="http://schemas.openxmlformats.org/drawingml/2006/main">
+              <a:graphicData uri="http://schemas.openxmlformats.org/drawingml/2006/picture">
+                <pic:pic xmlns:pic="http://schemas.openxmlformats.org/drawingml/2006/picture">
+                  <pic:nvPicPr>
+                    <pic:cNvPr id="1413748006" name=""/>
+                    <pic:cNvPicPr/>
+                  </pic:nvPicPr>
+                  <pic:blipFill>
+                    <a:blip r:embed="rId13"/>
+                    <a:stretch>
+                      <a:fillRect/>
+                    </a:stretch>
+                  </pic:blipFill>
+                  <pic:spPr>
+                    <a:xfrm>
+                      <a:off x="0" y="0"/>
+                      <a:ext cx="5943600" cy="1237615"/>
+                    </a:xfrm>
+                    <a:prstGeom prst="rect">
+                      <a:avLst/>
+                    </a:prstGeom>
+                  </pic:spPr>
+                </pic:pic>
+              </a:graphicData>
+            </a:graphic>
+          </wp:inline>
+        </w:drawing>
+      </w:r>
+      <w:proofErr w:type="spellStart"/>
+      <w:r>
+        <w:rPr>
+          <w:rFonts w:ascii="Times New Roman" w:hAnsi="Times New Roman" w:cs="Times New Roman"/>
+          <w:sz w:val="36"/>
+          <w:szCs w:val="36"/>
+        </w:rPr>
+        <w:t>Hình</w:t>
+      </w:r>
+      <w:proofErr w:type="spellEnd"/>
+      <w:r>
+        <w:rPr>
+          <w:rFonts w:ascii="Times New Roman" w:hAnsi="Times New Roman" w:cs="Times New Roman"/>
+          <w:sz w:val="36"/>
+          <w:szCs w:val="36"/>
+        </w:rPr>
+        <w:t xml:space="preserve"> 9: </w:t>
+      </w:r>
+      <w:proofErr w:type="spellStart"/>
+      <w:r>
+        <w:rPr>
+          <w:rFonts w:ascii="Times New Roman" w:hAnsi="Times New Roman" w:cs="Times New Roman"/>
+          <w:sz w:val="36"/>
+          <w:szCs w:val="36"/>
+        </w:rPr>
+        <w:t>K</w:t>
+      </w:r>
+      <w:r>
+        <w:rPr>
+          <w:rFonts w:ascii="Times New Roman" w:hAnsi="Times New Roman" w:cs="Times New Roman"/>
+          <w:sz w:val="36"/>
+          <w:szCs w:val="36"/>
+        </w:rPr>
+        <w:t>hởi</w:t>
+      </w:r>
+      <w:proofErr w:type="spellEnd"/>
+      <w:r>
+        <w:rPr>
+          <w:rFonts w:ascii="Times New Roman" w:hAnsi="Times New Roman" w:cs="Times New Roman"/>
+          <w:sz w:val="36"/>
+          <w:szCs w:val="36"/>
+        </w:rPr>
+        <w:t xml:space="preserve"> </w:t>
+      </w:r>
+      <w:proofErr w:type="spellStart"/>
+      <w:r>
+        <w:rPr>
+          <w:rFonts w:ascii="Times New Roman" w:hAnsi="Times New Roman" w:cs="Times New Roman"/>
+          <w:sz w:val="36"/>
+          <w:szCs w:val="36"/>
+        </w:rPr>
+        <w:t>động</w:t>
+      </w:r>
+      <w:proofErr w:type="spellEnd"/>
+      <w:r>
+        <w:rPr>
+          <w:rFonts w:ascii="Times New Roman" w:hAnsi="Times New Roman" w:cs="Times New Roman"/>
+          <w:sz w:val="36"/>
+          <w:szCs w:val="36"/>
+        </w:rPr>
+        <w:t xml:space="preserve"> Flask AP</w:t>
+      </w:r>
+      <w:r>
+        <w:rPr>
+          <w:rFonts w:ascii="Times New Roman" w:hAnsi="Times New Roman" w:cs="Times New Roman"/>
+          <w:sz w:val="36"/>
+          <w:szCs w:val="36"/>
+        </w:rPr>
+        <w:t>I</w:t>
+      </w:r>
+    </w:p>
+    <w:p>
+      <w:pPr>
+        <w:jc w:val="center"/>
+        <w:rPr>
+          <w:rFonts w:ascii="Times New Roman" w:hAnsi="Times New Roman" w:cs="Times New Roman"/>
+          <w:sz w:val="36"/>
+          <w:szCs w:val="36"/>
+        </w:rPr>
+      </w:pPr>
+    </w:p>
+    <w:p>
+      <w:pPr>
+        <w:rPr>
+          <w:rFonts w:ascii="Times New Roman" w:hAnsi="Times New Roman" w:cs="Times New Roman"/>
+          <w:b/>
+          <w:bCs/>
+          <w:sz w:val="36"/>
+          <w:szCs w:val="36"/>
+        </w:rPr>
+      </w:pPr>
+    </w:p>
+    <w:p>
+      <w:pPr>
+        <w:rPr>
+          <w:rFonts w:ascii="Times New Roman" w:hAnsi="Times New Roman" w:cs="Times New Roman"/>
+          <w:b/>
+          <w:bCs/>
+          <w:sz w:val="36"/>
+          <w:szCs w:val="36"/>
+        </w:rPr>
+      </w:pPr>
     </w:p>
     <w:sectPr>
       <w:pgSz w:w="12240" w:h="15840"/>

</xml_diff>

<commit_message>
docs(buoi5): hoan thien bao cao BaoCaoTuan 5.docx va README markdown voi day du anh minh chung
</commit_message>
<xml_diff>
--- a/Buoi5_21_10_26/BaoCaoTuan 5.docx
+++ b/Buoi5_21_10_26/BaoCaoTuan 5.docx
@@ -4099,68 +4099,60 @@
           <w:sz w:val="28"/>
           <w:szCs w:val="28"/>
         </w:rPr>
-        <w:br/>
-      </w:r>
-      <w:proofErr w:type="spellStart"/>
-      <w:r>
-        <w:rPr>
-          <w:rFonts w:ascii="Times New Roman" w:hAnsi="Times New Roman" w:cs="Times New Roman"/>
-          <w:sz w:val="28"/>
-          <w:szCs w:val="28"/>
-        </w:rPr>
-        <w:t>Hình</w:t>
-      </w:r>
-      <w:proofErr w:type="spellEnd"/>
-      <w:r>
-        <w:rPr>
-          <w:rFonts w:ascii="Times New Roman" w:hAnsi="Times New Roman" w:cs="Times New Roman"/>
-          <w:sz w:val="28"/>
-          <w:szCs w:val="28"/>
-        </w:rPr>
-        <w:t xml:space="preserve"> </w:t>
-      </w:r>
-      <w:r>
-        <w:rPr>
-          <w:rFonts w:ascii="Times New Roman" w:hAnsi="Times New Roman" w:cs="Times New Roman"/>
-          <w:sz w:val="28"/>
-          <w:szCs w:val="28"/>
-        </w:rPr>
-        <w:t>6</w:t>
-      </w:r>
-      <w:r>
-        <w:rPr>
-          <w:rFonts w:ascii="Times New Roman" w:hAnsi="Times New Roman" w:cs="Times New Roman"/>
-          <w:sz w:val="28"/>
-          <w:szCs w:val="28"/>
-        </w:rPr>
-        <w:t xml:space="preserve">: push code </w:t>
-      </w:r>
-      <w:proofErr w:type="spellStart"/>
-      <w:r>
-        <w:rPr>
-          <w:rFonts w:ascii="Times New Roman" w:hAnsi="Times New Roman" w:cs="Times New Roman"/>
-          <w:sz w:val="28"/>
-          <w:szCs w:val="28"/>
-        </w:rPr>
-        <w:t>lên</w:t>
-      </w:r>
-      <w:proofErr w:type="spellEnd"/>
-      <w:r>
-        <w:rPr>
-          <w:rFonts w:ascii="Times New Roman" w:hAnsi="Times New Roman" w:cs="Times New Roman"/>
-          <w:sz w:val="28"/>
-          <w:szCs w:val="28"/>
-        </w:rPr>
-        <w:t xml:space="preserve"> </w:t>
-      </w:r>
-      <w:proofErr w:type="spellStart"/>
-      <w:r>
-        <w:rPr>
-          <w:rFonts w:ascii="Times New Roman" w:hAnsi="Times New Roman" w:cs="Times New Roman"/>
-          <w:sz w:val="28"/>
-          <w:szCs w:val="28"/>
-        </w:rPr>
-        <w:t>github</w:t>
+      </w:r>
+      <w:proofErr w:type="spellStart"/>
+      <w:r>
+        <w:rPr>
+          <w:rFonts w:ascii="Times New Roman" w:hAnsi="Times New Roman" w:cs="Times New Roman"/>
+          <w:sz w:val="28"/>
+          <w:szCs w:val="28"/>
+        </w:rPr>
+      </w:r>
+      <w:proofErr w:type="spellEnd"/>
+      <w:r>
+        <w:rPr>
+          <w:rFonts w:ascii="Times New Roman" w:hAnsi="Times New Roman" w:cs="Times New Roman"/>
+          <w:sz w:val="28"/>
+          <w:szCs w:val="28"/>
+        </w:rPr>
+      </w:r>
+      <w:r>
+        <w:rPr>
+          <w:rFonts w:ascii="Times New Roman" w:hAnsi="Times New Roman" w:cs="Times New Roman"/>
+          <w:sz w:val="28"/>
+          <w:szCs w:val="28"/>
+        </w:rPr>
+      </w:r>
+      <w:r>
+        <w:rPr>
+          <w:rFonts w:ascii="Times New Roman" w:hAnsi="Times New Roman" w:cs="Times New Roman"/>
+          <w:sz w:val="28"/>
+          <w:szCs w:val="28"/>
+        </w:rPr>
+      </w:r>
+      <w:proofErr w:type="spellStart"/>
+      <w:r>
+        <w:rPr>
+          <w:rFonts w:ascii="Times New Roman" w:hAnsi="Times New Roman" w:cs="Times New Roman"/>
+          <w:sz w:val="28"/>
+          <w:szCs w:val="28"/>
+        </w:rPr>
+      </w:r>
+      <w:proofErr w:type="spellEnd"/>
+      <w:r>
+        <w:rPr>
+          <w:rFonts w:ascii="Times New Roman" w:hAnsi="Times New Roman" w:cs="Times New Roman"/>
+          <w:sz w:val="28"/>
+          <w:szCs w:val="28"/>
+        </w:rPr>
+      </w:r>
+      <w:proofErr w:type="spellStart"/>
+      <w:r>
+        <w:rPr>
+          <w:rFonts w:ascii="Times New Roman" w:hAnsi="Times New Roman" w:cs="Times New Roman"/>
+          <w:sz w:val="28"/>
+          <w:szCs w:val="28"/>
+        </w:rPr>
       </w:r>
       <w:proofErr w:type="spellEnd"/>
     </w:p>
@@ -4173,6 +4165,14 @@
           <w:szCs w:val="28"/>
         </w:rPr>
       </w:pPr>
+      <w:r/>
+      <w:r>
+        <w:rPr>
+          <w:rFonts w:ascii="Times New Roman" w:hAnsi="Times New Roman"/>
+          <w:sz w:val="28"/>
+        </w:rPr>
+        <w:t>Hình 6: Push code lên github</w:t>
+      </w:r>
     </w:p>
     <w:p>
       <w:pPr>
@@ -4197,6 +4197,403 @@
     </w:p>
     <w:p>
       <w:pPr>
+        <w:spacing w:after="0" w:line="276" w:lineRule="auto"/>
+      </w:pPr>
+      <w:r>
+        <w:rPr>
+          <w:rFonts w:ascii="Times New Roman" w:hAnsi="Times New Roman"/>
+          <w:b w:val="0"/>
+          <w:i w:val="0"/>
+          <w:sz w:val="28"/>
+        </w:rPr>
+        <w:t>1. Mục tiêu</w:t>
+      </w:r>
+    </w:p>
+    <w:p>
+      <w:pPr>
+        <w:spacing w:after="0" w:line="276" w:lineRule="auto"/>
+      </w:pPr>
+      <w:r>
+        <w:rPr>
+          <w:rFonts w:ascii="Times New Roman" w:hAnsi="Times New Roman"/>
+          <w:b w:val="0"/>
+          <w:i w:val="0"/>
+          <w:sz w:val="28"/>
+        </w:rPr>
+        <w:t>Xây dựng công cụ kiểm thử động (DAST) cho Python nhằm giám sát tài nguyên hệ thống (CPU, RAM, file descriptors), phân tích rò rỉ bộ nhớ, thống kê lưu lượng mạng, phát hiện các hành vi nguy hiểm trong thời gian chạy (runtime) và thực thi kiểm thử an toàn trong Virtual Sandbox, đồng thời cung cấp giao diện RESTful API qua Flask.</w:t>
+      </w:r>
+    </w:p>
+    <w:p>
+      <w:pPr>
+        <w:spacing w:after="0" w:line="276" w:lineRule="auto"/>
+      </w:pPr>
+      <w:r>
+        <w:rPr>
+          <w:rFonts w:ascii="Times New Roman" w:hAnsi="Times New Roman"/>
+          <w:b w:val="0"/>
+          <w:i w:val="0"/>
+          <w:sz w:val="28"/>
+        </w:rPr>
+        <w:t>2. Các module chính</w:t>
+      </w:r>
+    </w:p>
+    <w:p>
+      <w:pPr>
+        <w:spacing w:after="0" w:line="276" w:lineRule="auto"/>
+      </w:pPr>
+      <w:r>
+        <w:rPr>
+          <w:rFonts w:ascii="Times New Roman" w:hAnsi="Times New Roman"/>
+          <w:i/>
+          <w:sz w:val="28"/>
+        </w:rPr>
+        <w:t xml:space="preserve">runtime_monitor.py: </w:t>
+      </w:r>
+      <w:r>
+        <w:rPr>
+          <w:rFonts w:ascii="Times New Roman" w:hAnsi="Times New Roman"/>
+          <w:sz w:val="28"/>
+        </w:rPr>
+        <w:t>Giám sát tài nguyên phần cứng (CPU %, RAM RSS, danh sách file descriptors đang mở) của tiến trình theo PID.</w:t>
+      </w:r>
+    </w:p>
+    <w:p>
+      <w:pPr>
+        <w:spacing w:after="0" w:line="276" w:lineRule="auto"/>
+      </w:pPr>
+      <w:r>
+        <w:rPr>
+          <w:rFonts w:ascii="Times New Roman" w:hAnsi="Times New Roman"/>
+          <w:i/>
+          <w:sz w:val="28"/>
+        </w:rPr>
+        <w:t xml:space="preserve">memory_analyzer.py: </w:t>
+      </w:r>
+      <w:r>
+        <w:rPr>
+          <w:rFonts w:ascii="Times New Roman" w:hAnsi="Times New Roman"/>
+          <w:sz w:val="28"/>
+        </w:rPr>
+        <w:t>Thu dọn rác (Garbage Collection), phát hiện rò rỉ đối tượng và kiểm tra nguy cơ tràn số nguyên (integer overflow).</w:t>
+      </w:r>
+    </w:p>
+    <w:p>
+      <w:pPr>
+        <w:spacing w:after="0" w:line="276" w:lineRule="auto"/>
+      </w:pPr>
+      <w:r>
+        <w:rPr>
+          <w:rFonts w:ascii="Times New Roman" w:hAnsi="Times New Roman"/>
+          <w:i/>
+          <w:sz w:val="28"/>
+        </w:rPr>
+        <w:t xml:space="preserve">network_traffic_analyzer.py: </w:t>
+      </w:r>
+      <w:r>
+        <w:rPr>
+          <w:rFonts w:ascii="Times New Roman" w:hAnsi="Times New Roman"/>
+          <w:sz w:val="28"/>
+        </w:rPr>
+        <w:t>Thống kê lưu lượng mạng vào/ra (bytes, packets gửi và nhận) trên các card mạng qua psutil.</w:t>
+      </w:r>
+    </w:p>
+    <w:p>
+      <w:pPr>
+        <w:spacing w:after="0" w:line="276" w:lineRule="auto"/>
+      </w:pPr>
+      <w:r>
+        <w:rPr>
+          <w:rFonts w:ascii="Times New Roman" w:hAnsi="Times New Roman"/>
+          <w:i/>
+          <w:sz w:val="28"/>
+        </w:rPr>
+        <w:t xml:space="preserve">security_behavior_checker.py: </w:t>
+      </w:r>
+      <w:r>
+        <w:rPr>
+          <w:rFonts w:ascii="Times New Roman" w:hAnsi="Times New Roman"/>
+          <w:sz w:val="28"/>
+        </w:rPr>
+        <w:t>Giám sát và phát hiện việc thực thi các hàm hệ thống nhạy cảm và nguy hiểm (os.system, eval, exec).</w:t>
+      </w:r>
+    </w:p>
+    <w:p>
+      <w:pPr>
+        <w:spacing w:after="0" w:line="276" w:lineRule="auto"/>
+      </w:pPr>
+      <w:r>
+        <w:rPr>
+          <w:rFonts w:ascii="Times New Roman" w:hAnsi="Times New Roman"/>
+          <w:i/>
+          <w:sz w:val="28"/>
+        </w:rPr>
+        <w:t xml:space="preserve">virtual_sandbox.py: </w:t>
+      </w:r>
+      <w:r>
+        <w:rPr>
+          <w:rFonts w:ascii="Times New Roman" w:hAnsi="Times New Roman"/>
+          <w:sz w:val="28"/>
+        </w:rPr>
+        <w:t>Tạo môi trường thư mục tạm cô lập (sandbox) để thực thi lệnh shell an toàn, cô lập ảnh hưởng đến hệ thống.</w:t>
+      </w:r>
+    </w:p>
+    <w:p>
+      <w:pPr>
+        <w:spacing w:after="0" w:line="276" w:lineRule="auto"/>
+      </w:pPr>
+      <w:r>
+        <w:rPr>
+          <w:rFonts w:ascii="Times New Roman" w:hAnsi="Times New Roman"/>
+          <w:i/>
+          <w:sz w:val="28"/>
+        </w:rPr>
+        <w:t xml:space="preserve">app.py: </w:t>
+      </w:r>
+      <w:r>
+        <w:rPr>
+          <w:rFonts w:ascii="Times New Roman" w:hAnsi="Times New Roman"/>
+          <w:sz w:val="28"/>
+        </w:rPr>
+        <w:t>REST API Server xây dựng bằng Flask, cung cấp 5 endpoint để tương tác và kiểm thử toàn diện các module DAST.</w:t>
+      </w:r>
+    </w:p>
+    <w:p>
+      <w:pPr>
+        <w:spacing w:after="0" w:line="276" w:lineRule="auto"/>
+      </w:pPr>
+      <w:r>
+        <w:rPr>
+          <w:rFonts w:ascii="Times New Roman" w:hAnsi="Times New Roman"/>
+          <w:b w:val="0"/>
+          <w:i w:val="0"/>
+          <w:sz w:val="28"/>
+        </w:rPr>
+        <w:t>3. Kết quả thực nghiệm</w:t>
+      </w:r>
+    </w:p>
+    <w:p>
+      <w:pPr>
+        <w:spacing w:after="0" w:line="276" w:lineRule="auto"/>
+      </w:pPr>
+      <w:r>
+        <w:rPr>
+          <w:rFonts w:ascii="Times New Roman" w:hAnsi="Times New Roman"/>
+          <w:b w:val="0"/>
+          <w:i w:val="0"/>
+          <w:sz w:val="28"/>
+        </w:rPr>
+        <w:t>Unit Test:</w:t>
+      </w:r>
+    </w:p>
+    <w:p>
+      <w:pPr>
+        <w:spacing w:after="0" w:line="276" w:lineRule="auto"/>
+      </w:pPr>
+      <w:r>
+        <w:rPr>
+          <w:rFonts w:ascii="Times New Roman" w:hAnsi="Times New Roman"/>
+          <w:b w:val="0"/>
+          <w:i w:val="0"/>
+          <w:sz w:val="28"/>
+        </w:rPr>
+        <w:t>Lệnh: python -m unittest discover -s tests</w:t>
+      </w:r>
+    </w:p>
+    <w:p>
+      <w:pPr>
+        <w:spacing w:after="0" w:line="276" w:lineRule="auto"/>
+      </w:pPr>
+      <w:r>
+        <w:rPr>
+          <w:rFonts w:ascii="Times New Roman" w:hAnsi="Times New Roman"/>
+          <w:b w:val="0"/>
+          <w:i w:val="0"/>
+          <w:sz w:val="28"/>
+        </w:rPr>
+        <w:t>Kết quả: 5/5 tests PASS (OK), xác thực tính toàn vẹn và độ tin cậy của tất cả các module.</w:t>
+      </w:r>
+    </w:p>
+    <w:p>
+      <w:pPr>
+        <w:spacing w:after="0" w:line="276" w:lineRule="auto"/>
+      </w:pPr>
+    </w:p>
+    <w:p>
+      <w:pPr>
+        <w:spacing w:after="0" w:line="276" w:lineRule="auto"/>
+      </w:pPr>
+      <w:r>
+        <w:rPr>
+          <w:rFonts w:ascii="Times New Roman" w:hAnsi="Times New Roman"/>
+          <w:b w:val="0"/>
+          <w:i w:val="0"/>
+          <w:sz w:val="28"/>
+        </w:rPr>
+        <w:t>Chạy file main.py:</w:t>
+      </w:r>
+    </w:p>
+    <w:p>
+      <w:pPr>
+        <w:spacing w:after="0" w:line="276" w:lineRule="auto"/>
+      </w:pPr>
+      <w:r>
+        <w:rPr>
+          <w:rFonts w:ascii="Times New Roman" w:hAnsi="Times New Roman"/>
+          <w:b w:val="0"/>
+          <w:i w:val="0"/>
+          <w:sz w:val="28"/>
+        </w:rPr>
+        <w:t>Lệnh: python main.py</w:t>
+      </w:r>
+    </w:p>
+    <w:p>
+      <w:pPr>
+        <w:spacing w:after="0" w:line="276" w:lineRule="auto"/>
+      </w:pPr>
+      <w:r>
+        <w:rPr>
+          <w:rFonts w:ascii="Times New Roman" w:hAnsi="Times New Roman"/>
+          <w:b w:val="0"/>
+          <w:i w:val="0"/>
+          <w:sz w:val="28"/>
+        </w:rPr>
+        <w:t>Kết quả: Thu thập thành công các chỉ số tài nguyên, kiểm tra bộ nhớ không rò rỉ, thống kê lưu lượng I/O mạng và thực thi lệnh trong sandbox cô lập.</w:t>
+      </w:r>
+    </w:p>
+    <w:p>
+      <w:pPr>
+        <w:spacing w:after="0" w:line="276" w:lineRule="auto"/>
+      </w:pPr>
+      <w:r>
+        <w:rPr>
+          <w:rFonts w:ascii="Times New Roman" w:hAnsi="Times New Roman"/>
+          <w:b w:val="0"/>
+          <w:i w:val="0"/>
+          <w:sz w:val="28"/>
+        </w:rPr>
+        <w:t>Khởi động Flask API:</w:t>
+      </w:r>
+    </w:p>
+    <w:p>
+      <w:pPr>
+        <w:spacing w:after="0" w:line="276" w:lineRule="auto"/>
+      </w:pPr>
+      <w:r>
+        <w:rPr>
+          <w:rFonts w:ascii="Times New Roman" w:hAnsi="Times New Roman"/>
+          <w:b w:val="0"/>
+          <w:i w:val="0"/>
+          <w:sz w:val="28"/>
+        </w:rPr>
+        <w:t>Lệnh: python app.py</w:t>
+      </w:r>
+    </w:p>
+    <w:p>
+      <w:pPr>
+        <w:spacing w:after="0" w:line="276" w:lineRule="auto"/>
+      </w:pPr>
+      <w:r>
+        <w:rPr>
+          <w:rFonts w:ascii="Times New Roman" w:hAnsi="Times New Roman"/>
+          <w:b w:val="0"/>
+          <w:i w:val="0"/>
+          <w:sz w:val="28"/>
+        </w:rPr>
+        <w:t>Kết quả: Server Flask khởi chạy thành công tại địa chỉ http://localhost:5000, sẵn sàng tiếp nhận các yêu cầu phân tích DAST.</w:t>
+      </w:r>
+    </w:p>
+    <w:p>
+      <w:pPr>
+        <w:spacing w:after="0" w:line="276" w:lineRule="auto"/>
+      </w:pPr>
+      <w:r>
+        <w:rPr>
+          <w:rFonts w:ascii="Times New Roman" w:hAnsi="Times New Roman"/>
+          <w:b w:val="0"/>
+          <w:i w:val="0"/>
+          <w:sz w:val="28"/>
+        </w:rPr>
+        <w:t>Kiểm tra các API qua curl / PowerShell:</w:t>
+      </w:r>
+    </w:p>
+    <w:p>
+      <w:pPr>
+        <w:spacing w:after="0" w:line="276" w:lineRule="auto"/>
+      </w:pPr>
+      <w:r>
+        <w:rPr>
+          <w:rFonts w:ascii="Times New Roman" w:hAnsi="Times New Roman"/>
+          <w:b w:val="0"/>
+          <w:i w:val="0"/>
+          <w:sz w:val="28"/>
+        </w:rPr>
+        <w:t>Lệnh: Gọi kiểm tra 5 endpoints (/api/monitor, /api/memory, /api/network, /api/security, /api/sandbox).</w:t>
+      </w:r>
+    </w:p>
+    <w:p>
+      <w:pPr>
+        <w:spacing w:after="0" w:line="276" w:lineRule="auto"/>
+      </w:pPr>
+      <w:r>
+        <w:rPr>
+          <w:rFonts w:ascii="Times New Roman" w:hAnsi="Times New Roman"/>
+          <w:b w:val="0"/>
+          <w:i w:val="0"/>
+          <w:sz w:val="28"/>
+        </w:rPr>
+        <w:t>Kết quả: Nhận phản hồi JSON chính xác và đầy đủ từ cả 5 API.</w:t>
+      </w:r>
+    </w:p>
+    <w:p>
+      <w:pPr>
+        <w:spacing w:after="0" w:line="276" w:lineRule="auto"/>
+      </w:pPr>
+      <w:r>
+        <w:rPr>
+          <w:rFonts w:ascii="Times New Roman" w:hAnsi="Times New Roman"/>
+          <w:b w:val="0"/>
+          <w:i w:val="0"/>
+          <w:sz w:val="28"/>
+        </w:rPr>
+        <w:t>Git: Commit và push toàn bộ mã nguồn DAST tool lên GitHub thành công.</w:t>
+      </w:r>
+    </w:p>
+    <w:p>
+      <w:pPr>
+        <w:spacing w:after="0" w:line="276" w:lineRule="auto"/>
+      </w:pPr>
+      <w:r>
+        <w:rPr>
+          <w:rFonts w:ascii="Times New Roman" w:hAnsi="Times New Roman"/>
+          <w:b w:val="0"/>
+          <w:i w:val="0"/>
+          <w:sz w:val="28"/>
+        </w:rPr>
+        <w:t>4. Kết luận</w:t>
+      </w:r>
+    </w:p>
+    <w:p>
+      <w:pPr>
+        <w:spacing w:after="0" w:line="276" w:lineRule="auto"/>
+      </w:pPr>
+      <w:r>
+        <w:rPr>
+          <w:rFonts w:ascii="Times New Roman" w:hAnsi="Times New Roman"/>
+          <w:b w:val="0"/>
+          <w:i w:val="0"/>
+          <w:sz w:val="28"/>
+        </w:rPr>
+        <w:t>Hoàn thành công cụ DAST theo đúng yêu cầu slide; hệ thống hoạt động ổn định, giám sát thời gian thực chính xác và cung cấp giao diện API trực quan, an toàn.</w:t>
+      </w:r>
+    </w:p>
+    <w:p>
+      <w:pPr>
+        <w:spacing w:after="0" w:line="276" w:lineRule="auto"/>
+      </w:pPr>
+    </w:p>
+    <w:p>
+      <w:pPr>
+        <w:jc w:val="center"/>
         <w:rPr>
           <w:rFonts w:ascii="Times New Roman" w:hAnsi="Times New Roman" w:cs="Times New Roman"/>
           <w:b/>
@@ -4263,7 +4660,7 @@
       <w:r>
         <w:rPr>
           <w:rFonts w:ascii="Times New Roman" w:hAnsi="Times New Roman" w:cs="Times New Roman"/>
-          <w:sz w:val="36"/>
+          <w:sz w:val="28"/>
           <w:szCs w:val="36"/>
         </w:rPr>
         <w:t>Hình</w:t>
@@ -4272,7 +4669,7 @@
       <w:r>
         <w:rPr>
           <w:rFonts w:ascii="Times New Roman" w:hAnsi="Times New Roman" w:cs="Times New Roman"/>
-          <w:sz w:val="36"/>
+          <w:sz w:val="28"/>
           <w:szCs w:val="36"/>
         </w:rPr>
         <w:t xml:space="preserve"> 7: </w:t>
@@ -4281,7 +4678,7 @@
       <w:r>
         <w:rPr>
           <w:rFonts w:ascii="Times New Roman" w:hAnsi="Times New Roman" w:cs="Times New Roman"/>
-          <w:sz w:val="36"/>
+          <w:sz w:val="28"/>
           <w:szCs w:val="36"/>
         </w:rPr>
         <w:t>Chạy</w:t>
@@ -4290,7 +4687,7 @@
       <w:r>
         <w:rPr>
           <w:rFonts w:ascii="Times New Roman" w:hAnsi="Times New Roman" w:cs="Times New Roman"/>
-          <w:sz w:val="36"/>
+          <w:sz w:val="28"/>
           <w:szCs w:val="36"/>
         </w:rPr>
         <w:t xml:space="preserve"> Unit Test</w:t>
@@ -4371,7 +4768,7 @@
       <w:r>
         <w:rPr>
           <w:rFonts w:ascii="Times New Roman" w:hAnsi="Times New Roman" w:cs="Times New Roman"/>
-          <w:sz w:val="36"/>
+          <w:sz w:val="28"/>
           <w:szCs w:val="36"/>
         </w:rPr>
         <w:t>Hình</w:t>
@@ -4380,7 +4777,7 @@
       <w:r>
         <w:rPr>
           <w:rFonts w:ascii="Times New Roman" w:hAnsi="Times New Roman" w:cs="Times New Roman"/>
-          <w:sz w:val="36"/>
+          <w:sz w:val="28"/>
           <w:szCs w:val="36"/>
         </w:rPr>
         <w:t xml:space="preserve"> 8: </w:t>
@@ -4389,7 +4786,7 @@
       <w:r>
         <w:rPr>
           <w:rFonts w:ascii="Times New Roman" w:hAnsi="Times New Roman" w:cs="Times New Roman"/>
-          <w:sz w:val="36"/>
+          <w:sz w:val="28"/>
           <w:szCs w:val="36"/>
         </w:rPr>
         <w:t>Chạy</w:t>
@@ -4398,7 +4795,7 @@
       <w:r>
         <w:rPr>
           <w:rFonts w:ascii="Times New Roman" w:hAnsi="Times New Roman" w:cs="Times New Roman"/>
-          <w:sz w:val="36"/>
+          <w:sz w:val="28"/>
           <w:szCs w:val="36"/>
         </w:rPr>
         <w:t xml:space="preserve"> file </w:t>
@@ -4408,7 +4805,7 @@
           <w:rFonts w:ascii="Times New Roman" w:hAnsi="Times New Roman" w:cs="Times New Roman"/>
           <w:i/>
           <w:iCs/>
-          <w:sz w:val="36"/>
+          <w:sz w:val="28"/>
           <w:szCs w:val="36"/>
         </w:rPr>
         <w:t>“main.py”</w:t>
@@ -4483,7 +4880,6 @@
           <w:sz w:val="36"/>
           <w:szCs w:val="36"/>
         </w:rPr>
-        <w:t>Hình</w:t>
       </w:r>
       <w:proofErr w:type="spellEnd"/>
       <w:r>
@@ -4492,7 +4888,6 @@
           <w:sz w:val="36"/>
           <w:szCs w:val="36"/>
         </w:rPr>
-        <w:t xml:space="preserve"> 9: </w:t>
       </w:r>
       <w:proofErr w:type="spellStart"/>
       <w:r>
@@ -4501,7 +4896,6 @@
           <w:sz w:val="36"/>
           <w:szCs w:val="36"/>
         </w:rPr>
-        <w:t>K</w:t>
       </w:r>
       <w:r>
         <w:rPr>
@@ -4509,7 +4903,6 @@
           <w:sz w:val="36"/>
           <w:szCs w:val="36"/>
         </w:rPr>
-        <w:t>hởi</w:t>
       </w:r>
       <w:proofErr w:type="spellEnd"/>
       <w:r>
@@ -4518,7 +4911,6 @@
           <w:sz w:val="36"/>
           <w:szCs w:val="36"/>
         </w:rPr>
-        <w:t xml:space="preserve"> </w:t>
       </w:r>
       <w:proofErr w:type="spellStart"/>
       <w:r>
@@ -4527,7 +4919,6 @@
           <w:sz w:val="36"/>
           <w:szCs w:val="36"/>
         </w:rPr>
-        <w:t>động</w:t>
       </w:r>
       <w:proofErr w:type="spellEnd"/>
       <w:r>
@@ -4536,7 +4927,6 @@
           <w:sz w:val="36"/>
           <w:szCs w:val="36"/>
         </w:rPr>
-        <w:t xml:space="preserve"> Flask AP</w:t>
       </w:r>
       <w:r>
         <w:rPr>
@@ -4544,7 +4934,6 @@
           <w:sz w:val="36"/>
           <w:szCs w:val="36"/>
         </w:rPr>
-        <w:t>I</w:t>
       </w:r>
     </w:p>
     <w:p>
@@ -4556,6 +4945,13 @@
           <w:szCs w:val="36"/>
         </w:rPr>
       </w:pPr>
+      <w:r>
+        <w:rPr>
+          <w:rFonts w:ascii="Times New Roman" w:hAnsi="Times New Roman"/>
+          <w:sz w:val="28"/>
+        </w:rPr>
+        <w:t>Hình 9: Khởi động Flask API</w:t>
+      </w:r>
     </w:p>
     <w:p>
       <w:pPr>
@@ -4570,6 +4966,7 @@
     </w:p>
     <w:p>
       <w:pPr>
+        <w:jc w:val="center"/>
         <w:rPr>
           <w:rFonts w:ascii="Times New Roman" w:hAnsi="Times New Roman" w:cs="Times New Roman"/>
           <w:b/>
@@ -4578,6 +4975,104 @@
           <w:szCs w:val="36"/>
         </w:rPr>
       </w:pPr>
+      <w:r>
+        <w:drawing>
+          <wp:inline xmlns:a="http://schemas.openxmlformats.org/drawingml/2006/main" xmlns:pic="http://schemas.openxmlformats.org/drawingml/2006/picture">
+            <wp:extent cx="5486400" cy="1153792"/>
+            <wp:docPr id="1795429573" name="Picture 1795429573"/>
+            <wp:cNvGraphicFramePr>
+              <a:graphicFrameLocks noChangeAspect="1"/>
+            </wp:cNvGraphicFramePr>
+            <a:graphic>
+              <a:graphicData uri="http://schemas.openxmlformats.org/drawingml/2006/picture">
+                <pic:pic>
+                  <pic:nvPicPr>
+                    <pic:cNvPr id="0" name="docx_img_10.png"/>
+                    <pic:cNvPicPr/>
+                  </pic:nvPicPr>
+                  <pic:blipFill>
+                    <a:blip r:embed="rId16"/>
+                    <a:stretch>
+                      <a:fillRect/>
+                    </a:stretch>
+                  </pic:blipFill>
+                  <pic:spPr>
+                    <a:xfrm>
+                      <a:off x="0" y="0"/>
+                      <a:ext cx="5486400" cy="1153792"/>
+                    </a:xfrm>
+                    <a:prstGeom prst="rect"/>
+                  </pic:spPr>
+                </pic:pic>
+              </a:graphicData>
+            </a:graphic>
+          </wp:inline>
+        </w:drawing>
+      </w:r>
+    </w:p>
+    <w:p>
+      <w:pPr>
+        <w:jc w:val="center"/>
+      </w:pPr>
+      <w:r>
+        <w:rPr>
+          <w:rFonts w:ascii="Times New Roman" w:hAnsi="Times New Roman"/>
+          <w:sz w:val="28"/>
+        </w:rPr>
+        <w:t>Hình 10: Kiểm tra các API</w:t>
+      </w:r>
+    </w:p>
+    <w:p/>
+    <w:p>
+      <w:pPr>
+        <w:jc w:val="center"/>
+      </w:pPr>
+      <w:r>
+        <w:drawing>
+          <wp:inline xmlns:a="http://schemas.openxmlformats.org/drawingml/2006/main" xmlns:pic="http://schemas.openxmlformats.org/drawingml/2006/picture">
+            <wp:extent cx="5486400" cy="3383180"/>
+            <wp:docPr id="1795429574" name="Picture 1795429574"/>
+            <wp:cNvGraphicFramePr>
+              <a:graphicFrameLocks noChangeAspect="1"/>
+            </wp:cNvGraphicFramePr>
+            <a:graphic>
+              <a:graphicData uri="http://schemas.openxmlformats.org/drawingml/2006/picture">
+                <pic:pic>
+                  <pic:nvPicPr>
+                    <pic:cNvPr id="0" name="docx_img_11.png"/>
+                    <pic:cNvPicPr/>
+                  </pic:nvPicPr>
+                  <pic:blipFill>
+                    <a:blip r:embed="rId17"/>
+                    <a:stretch>
+                      <a:fillRect/>
+                    </a:stretch>
+                  </pic:blipFill>
+                  <pic:spPr>
+                    <a:xfrm>
+                      <a:off x="0" y="0"/>
+                      <a:ext cx="5486400" cy="3383180"/>
+                    </a:xfrm>
+                    <a:prstGeom prst="rect"/>
+                  </pic:spPr>
+                </pic:pic>
+              </a:graphicData>
+            </a:graphic>
+          </wp:inline>
+        </w:drawing>
+      </w:r>
+    </w:p>
+    <w:p>
+      <w:pPr>
+        <w:jc w:val="center"/>
+      </w:pPr>
+      <w:r>
+        <w:rPr>
+          <w:rFonts w:ascii="Times New Roman" w:hAnsi="Times New Roman"/>
+          <w:sz w:val="28"/>
+        </w:rPr>
+        <w:t>Hình 11: Push code lên github</w:t>
+      </w:r>
     </w:p>
     <w:sectPr>
       <w:pgSz w:w="12240" w:h="15840"/>

</xml_diff>

<commit_message>
docs: cap nhat markdown 5.4 voi hinh anh thuc nghiem moi tu file word
</commit_message>
<xml_diff>
--- a/Buoi5_21_10_26/BaoCaoTuan 5.docx
+++ b/Buoi5_21_10_26/BaoCaoTuan 5.docx
@@ -2302,6 +2302,65 @@
                     <a:xfrm>
                       <a:off x="0" y="0"/>
                       <a:ext cx="5943600" cy="1542415"/>
+                    </a:xfrm>
+                    <a:prstGeom prst="rect">
+                      <a:avLst/>
+                    </a:prstGeom>
+                  </pic:spPr>
+                </pic:pic>
+              </a:graphicData>
+            </a:graphic>
+          </wp:inline>
+        </w:drawing>
+      </w:r>
+    </w:p>
+    <w:p>
+      <w:pPr>
+        <w:jc w:val="center"/>
+        <w:rPr>
+          <w:rFonts w:ascii="Times New Roman" w:hAnsi="Times New Roman"/>
+          <w:sz w:val="28"/>
+        </w:rPr>
+      </w:pPr>
+    </w:p>
+    <w:p>
+      <w:pPr>
+        <w:jc w:val="center"/>
+        <w:rPr>
+          <w:rFonts w:ascii="Times New Roman" w:hAnsi="Times New Roman"/>
+          <w:sz w:val="28"/>
+        </w:rPr>
+      </w:pPr>
+      <w:r>
+        <w:rPr>
+          <w:rFonts w:ascii="Times New Roman" w:hAnsi="Times New Roman"/>
+          <w:sz w:val="28"/>
+        </w:rPr>
+        <w:drawing>
+          <wp:inline distT="0" distB="0" distL="0" distR="0" wp14:anchorId="424A1597" wp14:editId="08CB7059">
+            <wp:extent cx="5943600" cy="2401570"/>
+            <wp:effectExtent l="0" t="0" r="0" b="0"/>
+            <wp:docPr id="176829296" name="Picture 1"/>
+            <wp:cNvGraphicFramePr>
+              <a:graphicFrameLocks xmlns:a="http://schemas.openxmlformats.org/drawingml/2006/main" noChangeAspect="1"/>
+            </wp:cNvGraphicFramePr>
+            <a:graphic xmlns:a="http://schemas.openxmlformats.org/drawingml/2006/main">
+              <a:graphicData uri="http://schemas.openxmlformats.org/drawingml/2006/picture">
+                <pic:pic xmlns:pic="http://schemas.openxmlformats.org/drawingml/2006/picture">
+                  <pic:nvPicPr>
+                    <pic:cNvPr id="176829296" name=""/>
+                    <pic:cNvPicPr/>
+                  </pic:nvPicPr>
+                  <pic:blipFill>
+                    <a:blip r:embed="rId21"/>
+                    <a:stretch>
+                      <a:fillRect/>
+                    </a:stretch>
+                  </pic:blipFill>
+                  <pic:spPr>
+                    <a:xfrm>
+                      <a:off x="0" y="0"/>
+                      <a:ext cx="5943600" cy="2401570"/>
                     </a:xfrm>
                     <a:prstGeom prst="rect">
                       <a:avLst/>

</xml_diff>